<commit_message>
add task description and proposed tasks for students. Add waveforms + schematic
</commit_message>
<xml_diff>
--- a/vivado_projects/lab_03_clocks/doc/ClockGeneration.docx
+++ b/vivado_projects/lab_03_clocks/doc/ClockGeneration.docx
@@ -28,6 +28,15 @@
     <w:p/>
     <w:sdt>
       <w:sdtPr>
+        <w:rPr>
+          <w:rFonts w:ascii="Source Sans Pro" w:eastAsia="Times New Roman" w:hAnsi="Source Sans Pro" w:cs="Times New Roman"/>
+          <w:b w:val="0"/>
+          <w:bCs w:val="0"/>
+          <w:color w:val="auto"/>
+          <w:sz w:val="22"/>
+          <w:szCs w:val="22"/>
+          <w:lang w:eastAsia="en-US"/>
+        </w:rPr>
         <w:id w:val="-966578024"/>
         <w:docPartObj>
           <w:docPartGallery w:val="Table of Contents"/>
@@ -36,12 +45,7 @@
       </w:sdtPr>
       <w:sdtEndPr>
         <w:rPr>
-          <w:rFonts w:ascii="Source Sans Pro" w:eastAsia="Times New Roman" w:hAnsi="Source Sans Pro" w:cs="Times New Roman"/>
           <w:noProof/>
-          <w:color w:val="auto"/>
-          <w:sz w:val="22"/>
-          <w:szCs w:val="22"/>
-          <w:lang w:eastAsia="en-US"/>
         </w:rPr>
       </w:sdtEndPr>
       <w:sdtContent>
@@ -240,8 +244,254 @@
     <w:p>
       <w:pPr>
         <w:pStyle w:val="Heading1"/>
+        <w:rPr>
+          <w:lang w:val="uk-UA"/>
+        </w:rPr>
       </w:pPr>
       <w:bookmarkStart w:id="1" w:name="_Toc234854321"/>
+      <w:r>
+        <w:rPr>
+          <w:lang w:val="uk-UA"/>
+        </w:rPr>
+        <w:lastRenderedPageBreak/>
+        <w:t>Мета та завдання</w:t>
+      </w:r>
+    </w:p>
+    <w:p>
+      <w:pPr>
+        <w:pStyle w:val="Body"/>
+        <w:rPr>
+          <w:lang w:val="uk-UA"/>
+        </w:rPr>
+      </w:pPr>
+    </w:p>
+    <w:p>
+      <w:pPr>
+        <w:pStyle w:val="Body"/>
+        <w:numPr>
+          <w:ilvl w:val="0"/>
+          <w:numId w:val="32"/>
+        </w:numPr>
+        <w:rPr>
+          <w:lang w:val="uk-UA"/>
+        </w:rPr>
+      </w:pPr>
+      <w:r>
+        <w:rPr>
+          <w:lang w:val="uk-UA"/>
+        </w:rPr>
+        <w:t xml:space="preserve">Навчитись створювати </w:t>
+      </w:r>
+      <w:r>
+        <w:rPr>
+          <w:lang w:val="uk-UA"/>
+        </w:rPr>
+        <w:t xml:space="preserve">IP </w:t>
+      </w:r>
+      <w:r>
+        <w:rPr>
+          <w:lang w:val="uk-UA"/>
+        </w:rPr>
+        <w:t xml:space="preserve">блоки засобами </w:t>
+      </w:r>
+      <w:proofErr w:type="spellStart"/>
+      <w:r>
+        <w:rPr>
+          <w:lang w:val="uk-UA"/>
+        </w:rPr>
+        <w:t>Vivado</w:t>
+      </w:r>
+      <w:proofErr w:type="spellEnd"/>
+      <w:r>
+        <w:rPr>
+          <w:lang w:val="uk-UA"/>
+        </w:rPr>
+        <w:t xml:space="preserve"> </w:t>
+      </w:r>
+      <w:r>
+        <w:rPr>
+          <w:lang w:val="uk-UA"/>
+        </w:rPr>
+        <w:t xml:space="preserve">та налаштовувати їх. Зробити це на прикладі </w:t>
+      </w:r>
+      <w:proofErr w:type="spellStart"/>
+      <w:r>
+        <w:rPr>
+          <w:lang w:val="uk-UA"/>
+        </w:rPr>
+        <w:t>Clock</w:t>
+      </w:r>
+      <w:r>
+        <w:t>ing</w:t>
+      </w:r>
+      <w:proofErr w:type="spellEnd"/>
+      <w:r>
+        <w:rPr>
+          <w:lang w:val="uk-UA"/>
+        </w:rPr>
+        <w:t xml:space="preserve"> </w:t>
+      </w:r>
+      <w:proofErr w:type="spellStart"/>
+      <w:r>
+        <w:rPr>
+          <w:lang w:val="uk-UA"/>
+        </w:rPr>
+        <w:t>Wizard</w:t>
+      </w:r>
+      <w:proofErr w:type="spellEnd"/>
+      <w:r>
+        <w:rPr>
+          <w:lang w:val="uk-UA"/>
+        </w:rPr>
+        <w:t>.</w:t>
+      </w:r>
+    </w:p>
+    <w:p>
+      <w:pPr>
+        <w:pStyle w:val="Body"/>
+        <w:numPr>
+          <w:ilvl w:val="0"/>
+          <w:numId w:val="32"/>
+        </w:numPr>
+        <w:rPr>
+          <w:lang w:val="uk-UA"/>
+        </w:rPr>
+      </w:pPr>
+      <w:r>
+        <w:rPr>
+          <w:lang w:val="uk-UA"/>
+        </w:rPr>
+        <w:t xml:space="preserve">Зовнішній сигнал </w:t>
+      </w:r>
+      <w:proofErr w:type="spellStart"/>
+      <w:r>
+        <w:rPr>
+          <w:lang w:val="uk-UA"/>
+        </w:rPr>
+        <w:t>тактування</w:t>
+      </w:r>
+      <w:proofErr w:type="spellEnd"/>
+      <w:r>
+        <w:rPr>
+          <w:lang w:val="uk-UA"/>
+        </w:rPr>
+        <w:t xml:space="preserve"> подати на </w:t>
+      </w:r>
+      <w:r>
+        <w:rPr>
+          <w:lang w:val="uk-UA"/>
+        </w:rPr>
+        <w:t>апаратний</w:t>
+      </w:r>
+      <w:r>
+        <w:rPr>
+          <w:lang w:val="uk-UA"/>
+        </w:rPr>
+        <w:t xml:space="preserve"> блок </w:t>
+      </w:r>
+      <w:r>
+        <w:rPr>
+          <w:lang w:val="uk-UA"/>
+        </w:rPr>
+        <w:t>MMCM (Mixed-Mode Clock Manager)</w:t>
+      </w:r>
+      <w:r>
+        <w:rPr>
+          <w:lang w:val="uk-UA"/>
+        </w:rPr>
+        <w:t xml:space="preserve">, який містить в собі ФАПЧ. З допомогою цього блоку згенерувати </w:t>
+      </w:r>
+      <w:r>
+        <w:rPr>
+          <w:lang w:val="uk-UA"/>
+        </w:rPr>
+        <w:t>необхідну</w:t>
+      </w:r>
+      <w:r>
+        <w:rPr>
+          <w:lang w:val="uk-UA"/>
+        </w:rPr>
+        <w:t xml:space="preserve"> частоту, наприклад 6 МГц.</w:t>
+      </w:r>
+    </w:p>
+    <w:p>
+      <w:pPr>
+        <w:pStyle w:val="Body"/>
+        <w:numPr>
+          <w:ilvl w:val="0"/>
+          <w:numId w:val="32"/>
+        </w:numPr>
+        <w:rPr>
+          <w:lang w:val="uk-UA"/>
+        </w:rPr>
+      </w:pPr>
+      <w:r>
+        <w:rPr>
+          <w:lang w:val="uk-UA"/>
+        </w:rPr>
+        <w:t xml:space="preserve">На мові Verilog </w:t>
+      </w:r>
+      <w:proofErr w:type="spellStart"/>
+      <w:r>
+        <w:rPr>
+          <w:lang w:val="uk-UA"/>
+        </w:rPr>
+        <w:t>cтворити</w:t>
+      </w:r>
+      <w:proofErr w:type="spellEnd"/>
+      <w:r>
+        <w:rPr>
+          <w:lang w:val="uk-UA"/>
+        </w:rPr>
+        <w:t xml:space="preserve"> модуль </w:t>
+      </w:r>
+      <w:r>
+        <w:rPr>
+          <w:lang w:val="uk-UA"/>
+        </w:rPr>
+        <w:t>по</w:t>
+      </w:r>
+      <w:r>
+        <w:rPr>
+          <w:lang w:val="uk-UA"/>
+        </w:rPr>
+        <w:t>дільника частоти</w:t>
+      </w:r>
+      <w:r>
+        <w:rPr>
+          <w:lang w:val="uk-UA"/>
+        </w:rPr>
+        <w:t xml:space="preserve"> з параметром, що задає коефіцієнт ділення</w:t>
+      </w:r>
+      <w:r>
+        <w:rPr>
+          <w:lang w:val="uk-UA"/>
+        </w:rPr>
+        <w:t xml:space="preserve">. З допомогою такого модуля зробити кілька подільників частот. </w:t>
+      </w:r>
+    </w:p>
+    <w:p>
+      <w:pPr>
+        <w:pStyle w:val="Body"/>
+        <w:numPr>
+          <w:ilvl w:val="0"/>
+          <w:numId w:val="32"/>
+        </w:numPr>
+        <w:rPr>
+          <w:lang w:val="uk-UA"/>
+        </w:rPr>
+      </w:pPr>
+      <w:r>
+        <w:rPr>
+          <w:lang w:val="uk-UA"/>
+        </w:rPr>
+        <w:t>Для перевірки на залізі вивести поділені частоти на світлодіоди. Перевірити частоти їх блимання.</w:t>
+      </w:r>
+    </w:p>
+    <w:p>
+      <w:pPr>
+        <w:pStyle w:val="Heading1"/>
+      </w:pPr>
       <w:r>
         <w:lastRenderedPageBreak/>
         <w:t>Theory</w:t>
@@ -291,13 +541,15 @@
     <w:p/>
     <w:p>
       <w:r>
-        <w:t>Multi-region clock-capable</w:t>
-      </w:r>
-      <w:r>
-        <w:t xml:space="preserve"> </w:t>
-      </w:r>
-      <w:r>
-        <w:t>I/O (</w:t>
+        <w:t xml:space="preserve">Multi-region </w:t>
+      </w:r>
+      <w:proofErr w:type="gramStart"/>
+      <w:r>
+        <w:t>clock-capable</w:t>
+      </w:r>
+      <w:proofErr w:type="gramEnd"/>
+      <w:r>
+        <w:t xml:space="preserve"> I/O (</w:t>
       </w:r>
       <w:r>
         <w:rPr>
@@ -369,7 +621,25 @@
           <w:sz w:val="24"/>
           <w:szCs w:val="24"/>
         </w:rPr>
-        <w:t xml:space="preserve"> (an MRCC input on bank 14). This clock is intended to be used as a general purpose system clock. The clock can drive MMCMs to generate clocks of various frequencies and with known phase relationships that may be needed throughout a design. The 12 MHz input clock cannot directly drive a PLL because they have a minimum input frequency of 19 </w:t>
+        <w:t xml:space="preserve"> (an MRCC input on bank 14). This clock is intended to be used as a </w:t>
+      </w:r>
+      <w:proofErr w:type="gramStart"/>
+      <w:r>
+        <w:rPr>
+          <w:rFonts w:ascii="Times New Roman" w:hAnsi="Times New Roman"/>
+          <w:sz w:val="24"/>
+          <w:szCs w:val="24"/>
+        </w:rPr>
+        <w:t>general purpose</w:t>
+      </w:r>
+      <w:proofErr w:type="gramEnd"/>
+      <w:r>
+        <w:rPr>
+          <w:rFonts w:ascii="Times New Roman" w:hAnsi="Times New Roman"/>
+          <w:sz w:val="24"/>
+          <w:szCs w:val="24"/>
+        </w:rPr>
+        <w:t xml:space="preserve"> system clock. The clock can drive MMCMs to generate clocks of various frequencies and with known phase relationships that may be needed throughout a design. The 12 MHz input clock cannot directly drive a PLL because they have a minimum input frequency of 19 </w:t>
       </w:r>
       <w:proofErr w:type="spellStart"/>
       <w:r>
@@ -616,6 +886,9 @@
     <w:p/>
     <w:p>
       <w:r>
+        <w:rPr>
+          <w:noProof/>
+        </w:rPr>
         <w:lastRenderedPageBreak/>
         <w:drawing>
           <wp:inline distT="0" distB="0" distL="0" distR="0" wp14:anchorId="25133C0B" wp14:editId="77A66EAE">
@@ -657,6 +930,9 @@
     <w:p/>
     <w:p>
       <w:r>
+        <w:rPr>
+          <w:noProof/>
+        </w:rPr>
         <w:drawing>
           <wp:inline distT="0" distB="0" distL="0" distR="0" wp14:anchorId="0ED08D67" wp14:editId="0231F304">
             <wp:extent cx="5731510" cy="4670425"/>
@@ -699,6 +975,9 @@
     <w:p/>
     <w:p>
       <w:r>
+        <w:rPr>
+          <w:noProof/>
+        </w:rPr>
         <w:drawing>
           <wp:inline distT="0" distB="0" distL="0" distR="0" wp14:anchorId="199A3AE1" wp14:editId="6BBBA25C">
             <wp:extent cx="5731510" cy="3744595"/>
@@ -754,6 +1033,7 @@
     <w:p>
       <w:r>
         <w:rPr>
+          <w:noProof/>
           <w:lang w:val="uk-UA"/>
         </w:rPr>
         <w:drawing>
@@ -816,40 +1096,14 @@
         <w:pStyle w:val="Body"/>
       </w:pPr>
       <w:r>
-        <w:t xml:space="preserve">Demo projects repository for Cmod-S7: </w:t>
-      </w:r>
-      <w:hyperlink r:id="rId18" w:history="1">
-        <w:r>
-          <w:rPr>
-            <w:rStyle w:val="Hyperlink"/>
-          </w:rPr>
-          <w:t>https://github.com/digilent/cmod-s7/tree/25/OOB/master</w:t>
-        </w:r>
-      </w:hyperlink>
+        <w:t>Clocking Wizard usage:</w:t>
+      </w:r>
     </w:p>
     <w:p>
       <w:pPr>
         <w:pStyle w:val="Body"/>
       </w:pPr>
-    </w:p>
-    <w:p>
-      <w:pPr>
-        <w:pStyle w:val="Body"/>
-      </w:pPr>
-    </w:p>
-    <w:p>
-      <w:pPr>
-        <w:pStyle w:val="Body"/>
-      </w:pPr>
-      <w:r>
-        <w:t>Clocking Wizard usage:</w:t>
-      </w:r>
-    </w:p>
-    <w:p>
-      <w:pPr>
-        <w:pStyle w:val="Body"/>
-      </w:pPr>
-      <w:hyperlink r:id="rId19" w:history="1">
+      <w:hyperlink r:id="rId18" w:history="1">
         <w:r>
           <w:rPr>
             <w:rStyle w:val="Hyperlink"/>
@@ -873,6 +1127,9 @@
         <w:pStyle w:val="Body"/>
       </w:pPr>
       <w:r>
+        <w:rPr>
+          <w:noProof/>
+        </w:rPr>
         <w:drawing>
           <wp:inline distT="0" distB="0" distL="0" distR="0" wp14:anchorId="5907012E" wp14:editId="4BC1BD5A">
             <wp:extent cx="5731510" cy="3034030"/>
@@ -889,7 +1146,7 @@
                     <pic:cNvPicPr/>
                   </pic:nvPicPr>
                   <pic:blipFill>
-                    <a:blip r:embed="rId20"/>
+                    <a:blip r:embed="rId19"/>
                     <a:stretch>
                       <a:fillRect/>
                     </a:stretch>
@@ -925,7 +1182,9 @@
         <w:pStyle w:val="Body"/>
       </w:pPr>
       <w:r>
-        <w:lastRenderedPageBreak/>
+        <w:rPr>
+          <w:noProof/>
+        </w:rPr>
         <w:drawing>
           <wp:inline distT="0" distB="0" distL="0" distR="0" wp14:anchorId="0413352E" wp14:editId="062E3BD3">
             <wp:extent cx="5731510" cy="3171190"/>
@@ -942,7 +1201,7 @@
                     <pic:cNvPicPr/>
                   </pic:nvPicPr>
                   <pic:blipFill>
-                    <a:blip r:embed="rId21"/>
+                    <a:blip r:embed="rId20"/>
                     <a:stretch>
                       <a:fillRect/>
                     </a:stretch>
@@ -973,6 +1232,9 @@
         <w:pStyle w:val="Body"/>
       </w:pPr>
       <w:r>
+        <w:rPr>
+          <w:noProof/>
+        </w:rPr>
         <w:drawing>
           <wp:inline distT="0" distB="0" distL="0" distR="0" wp14:anchorId="3D5F5103" wp14:editId="2CBA6698">
             <wp:extent cx="5731510" cy="3945255"/>
@@ -989,7 +1251,7 @@
                     <pic:cNvPicPr/>
                   </pic:nvPicPr>
                   <pic:blipFill>
-                    <a:blip r:embed="rId22"/>
+                    <a:blip r:embed="rId21"/>
                     <a:stretch>
                       <a:fillRect/>
                     </a:stretch>
@@ -1020,6 +1282,9 @@
         <w:pStyle w:val="Body"/>
       </w:pPr>
       <w:r>
+        <w:rPr>
+          <w:noProof/>
+        </w:rPr>
         <w:lastRenderedPageBreak/>
         <w:drawing>
           <wp:inline distT="0" distB="0" distL="0" distR="0" wp14:anchorId="2D9F64DF" wp14:editId="56ED878B">
@@ -1037,7 +1302,7 @@
                     <pic:cNvPicPr/>
                   </pic:nvPicPr>
                   <pic:blipFill>
-                    <a:blip r:embed="rId23"/>
+                    <a:blip r:embed="rId22"/>
                     <a:stretch>
                       <a:fillRect/>
                     </a:stretch>
@@ -1068,13 +1333,489 @@
         <w:pStyle w:val="Body"/>
       </w:pPr>
     </w:p>
+    <w:p>
+      <w:pPr>
+        <w:pStyle w:val="Body"/>
+      </w:pPr>
+    </w:p>
+    <w:p>
+      <w:pPr>
+        <w:pStyle w:val="Body"/>
+      </w:pPr>
+    </w:p>
+    <w:p>
+      <w:pPr>
+        <w:pStyle w:val="Body"/>
+      </w:pPr>
+    </w:p>
+    <w:p>
+      <w:pPr>
+        <w:pStyle w:val="Body"/>
+      </w:pPr>
+    </w:p>
+    <w:p>
+      <w:pPr>
+        <w:pStyle w:val="Body"/>
+      </w:pPr>
+      <w:r>
+        <w:t xml:space="preserve">To re-generate </w:t>
+      </w:r>
+      <w:proofErr w:type="gramStart"/>
+      <w:r>
+        <w:t>output</w:t>
+      </w:r>
+      <w:proofErr w:type="gramEnd"/>
+      <w:r>
+        <w:t xml:space="preserve"> we can use context menu:</w:t>
+      </w:r>
+    </w:p>
+    <w:p>
+      <w:pPr>
+        <w:pStyle w:val="Body"/>
+      </w:pPr>
+    </w:p>
+    <w:p>
+      <w:pPr>
+        <w:pStyle w:val="Body"/>
+      </w:pPr>
+      <w:r>
+        <w:drawing>
+          <wp:inline distT="0" distB="0" distL="0" distR="0" wp14:anchorId="2AEA296A" wp14:editId="74438373">
+            <wp:extent cx="4915586" cy="2924583"/>
+            <wp:effectExtent l="0" t="0" r="0" b="9525"/>
+            <wp:docPr id="1797655720" name="Picture 1"/>
+            <wp:cNvGraphicFramePr>
+              <a:graphicFrameLocks xmlns:a="http://schemas.openxmlformats.org/drawingml/2006/main" noChangeAspect="1"/>
+            </wp:cNvGraphicFramePr>
+            <a:graphic xmlns:a="http://schemas.openxmlformats.org/drawingml/2006/main">
+              <a:graphicData uri="http://schemas.openxmlformats.org/drawingml/2006/picture">
+                <pic:pic xmlns:pic="http://schemas.openxmlformats.org/drawingml/2006/picture">
+                  <pic:nvPicPr>
+                    <pic:cNvPr id="1797655720" name=""/>
+                    <pic:cNvPicPr/>
+                  </pic:nvPicPr>
+                  <pic:blipFill>
+                    <a:blip r:embed="rId23"/>
+                    <a:stretch>
+                      <a:fillRect/>
+                    </a:stretch>
+                  </pic:blipFill>
+                  <pic:spPr>
+                    <a:xfrm>
+                      <a:off x="0" y="0"/>
+                      <a:ext cx="4915586" cy="2924583"/>
+                    </a:xfrm>
+                    <a:prstGeom prst="rect">
+                      <a:avLst/>
+                    </a:prstGeom>
+                  </pic:spPr>
+                </pic:pic>
+              </a:graphicData>
+            </a:graphic>
+          </wp:inline>
+        </w:drawing>
+      </w:r>
+    </w:p>
+    <w:p>
+      <w:pPr>
+        <w:pStyle w:val="Body"/>
+      </w:pPr>
+    </w:p>
+    <w:p>
+      <w:pPr>
+        <w:pStyle w:val="Body"/>
+      </w:pPr>
+    </w:p>
+    <w:p>
+      <w:pPr>
+        <w:pStyle w:val="Body"/>
+      </w:pPr>
+    </w:p>
+    <w:p>
+      <w:pPr>
+        <w:pStyle w:val="Heading1"/>
+      </w:pPr>
+      <w:r>
+        <w:lastRenderedPageBreak/>
+        <w:t>Simulation results</w:t>
+      </w:r>
+    </w:p>
+    <w:p>
+      <w:pPr>
+        <w:pStyle w:val="Body"/>
+      </w:pPr>
+    </w:p>
+    <w:p>
+      <w:pPr>
+        <w:pStyle w:val="Body"/>
+      </w:pPr>
+      <w:r>
+        <w:drawing>
+          <wp:inline distT="0" distB="0" distL="0" distR="0" wp14:anchorId="70312E52" wp14:editId="2FE173BC">
+            <wp:extent cx="5731510" cy="2022475"/>
+            <wp:effectExtent l="0" t="0" r="2540" b="0"/>
+            <wp:docPr id="1552409500" name="Picture 1"/>
+            <wp:cNvGraphicFramePr>
+              <a:graphicFrameLocks xmlns:a="http://schemas.openxmlformats.org/drawingml/2006/main" noChangeAspect="1"/>
+            </wp:cNvGraphicFramePr>
+            <a:graphic xmlns:a="http://schemas.openxmlformats.org/drawingml/2006/main">
+              <a:graphicData uri="http://schemas.openxmlformats.org/drawingml/2006/picture">
+                <pic:pic xmlns:pic="http://schemas.openxmlformats.org/drawingml/2006/picture">
+                  <pic:nvPicPr>
+                    <pic:cNvPr id="1552409500" name=""/>
+                    <pic:cNvPicPr/>
+                  </pic:nvPicPr>
+                  <pic:blipFill>
+                    <a:blip r:embed="rId24"/>
+                    <a:stretch>
+                      <a:fillRect/>
+                    </a:stretch>
+                  </pic:blipFill>
+                  <pic:spPr>
+                    <a:xfrm>
+                      <a:off x="0" y="0"/>
+                      <a:ext cx="5731510" cy="2022475"/>
+                    </a:xfrm>
+                    <a:prstGeom prst="rect">
+                      <a:avLst/>
+                    </a:prstGeom>
+                  </pic:spPr>
+                </pic:pic>
+              </a:graphicData>
+            </a:graphic>
+          </wp:inline>
+        </w:drawing>
+      </w:r>
+    </w:p>
+    <w:p>
+      <w:pPr>
+        <w:pStyle w:val="Body"/>
+      </w:pPr>
+    </w:p>
+    <w:p>
+      <w:pPr>
+        <w:pStyle w:val="Body"/>
+      </w:pPr>
+      <w:r>
+        <w:drawing>
+          <wp:inline distT="0" distB="0" distL="0" distR="0" wp14:anchorId="35037AF2" wp14:editId="2B50D851">
+            <wp:extent cx="5731510" cy="1715135"/>
+            <wp:effectExtent l="0" t="0" r="2540" b="0"/>
+            <wp:docPr id="57431181" name="Picture 1"/>
+            <wp:cNvGraphicFramePr>
+              <a:graphicFrameLocks xmlns:a="http://schemas.openxmlformats.org/drawingml/2006/main" noChangeAspect="1"/>
+            </wp:cNvGraphicFramePr>
+            <a:graphic xmlns:a="http://schemas.openxmlformats.org/drawingml/2006/main">
+              <a:graphicData uri="http://schemas.openxmlformats.org/drawingml/2006/picture">
+                <pic:pic xmlns:pic="http://schemas.openxmlformats.org/drawingml/2006/picture">
+                  <pic:nvPicPr>
+                    <pic:cNvPr id="57431181" name=""/>
+                    <pic:cNvPicPr/>
+                  </pic:nvPicPr>
+                  <pic:blipFill>
+                    <a:blip r:embed="rId25"/>
+                    <a:stretch>
+                      <a:fillRect/>
+                    </a:stretch>
+                  </pic:blipFill>
+                  <pic:spPr>
+                    <a:xfrm>
+                      <a:off x="0" y="0"/>
+                      <a:ext cx="5731510" cy="1715135"/>
+                    </a:xfrm>
+                    <a:prstGeom prst="rect">
+                      <a:avLst/>
+                    </a:prstGeom>
+                  </pic:spPr>
+                </pic:pic>
+              </a:graphicData>
+            </a:graphic>
+          </wp:inline>
+        </w:drawing>
+      </w:r>
+    </w:p>
+    <w:p>
+      <w:pPr>
+        <w:pStyle w:val="Body"/>
+      </w:pPr>
+    </w:p>
+    <w:p>
+      <w:pPr>
+        <w:pStyle w:val="Body"/>
+      </w:pPr>
+      <w:r>
+        <w:drawing>
+          <wp:inline distT="0" distB="0" distL="0" distR="0" wp14:anchorId="5FE1CC8C" wp14:editId="2A8312DC">
+            <wp:extent cx="5731510" cy="2468880"/>
+            <wp:effectExtent l="0" t="0" r="2540" b="7620"/>
+            <wp:docPr id="655184719" name="Picture 1"/>
+            <wp:cNvGraphicFramePr>
+              <a:graphicFrameLocks xmlns:a="http://schemas.openxmlformats.org/drawingml/2006/main" noChangeAspect="1"/>
+            </wp:cNvGraphicFramePr>
+            <a:graphic xmlns:a="http://schemas.openxmlformats.org/drawingml/2006/main">
+              <a:graphicData uri="http://schemas.openxmlformats.org/drawingml/2006/picture">
+                <pic:pic xmlns:pic="http://schemas.openxmlformats.org/drawingml/2006/picture">
+                  <pic:nvPicPr>
+                    <pic:cNvPr id="655184719" name=""/>
+                    <pic:cNvPicPr/>
+                  </pic:nvPicPr>
+                  <pic:blipFill>
+                    <a:blip r:embed="rId26"/>
+                    <a:stretch>
+                      <a:fillRect/>
+                    </a:stretch>
+                  </pic:blipFill>
+                  <pic:spPr>
+                    <a:xfrm>
+                      <a:off x="0" y="0"/>
+                      <a:ext cx="5731510" cy="2468880"/>
+                    </a:xfrm>
+                    <a:prstGeom prst="rect">
+                      <a:avLst/>
+                    </a:prstGeom>
+                  </pic:spPr>
+                </pic:pic>
+              </a:graphicData>
+            </a:graphic>
+          </wp:inline>
+        </w:drawing>
+      </w:r>
+    </w:p>
+    <w:p>
+      <w:pPr>
+        <w:pStyle w:val="Body"/>
+      </w:pPr>
+    </w:p>
+    <w:p>
+      <w:pPr>
+        <w:pStyle w:val="Body"/>
+      </w:pPr>
+    </w:p>
+    <w:p>
+      <w:pPr>
+        <w:pStyle w:val="Body"/>
+      </w:pPr>
+    </w:p>
+    <w:p>
+      <w:pPr>
+        <w:pStyle w:val="Body"/>
+      </w:pPr>
+    </w:p>
+    <w:p>
+      <w:pPr>
+        <w:pStyle w:val="Body"/>
+      </w:pPr>
+    </w:p>
+    <w:p>
+      <w:pPr>
+        <w:pStyle w:val="Body"/>
+        <w:rPr>
+          <w:lang w:val="uk-UA"/>
+        </w:rPr>
+      </w:pPr>
+      <w:r>
+        <w:rPr>
+          <w:lang w:val="uk-UA"/>
+        </w:rPr>
+        <w:t>Синтезована схема:</w:t>
+      </w:r>
+    </w:p>
+    <w:p>
+      <w:pPr>
+        <w:pStyle w:val="Body"/>
+        <w:rPr>
+          <w:lang w:val="uk-UA"/>
+        </w:rPr>
+      </w:pPr>
+      <w:r>
+        <w:drawing>
+          <wp:inline distT="0" distB="0" distL="0" distR="0" wp14:anchorId="6F598E7F" wp14:editId="0BD107C6">
+            <wp:extent cx="5731510" cy="3929380"/>
+            <wp:effectExtent l="0" t="0" r="2540" b="0"/>
+            <wp:docPr id="641094766" name="Picture 1"/>
+            <wp:cNvGraphicFramePr>
+              <a:graphicFrameLocks xmlns:a="http://schemas.openxmlformats.org/drawingml/2006/main" noChangeAspect="1"/>
+            </wp:cNvGraphicFramePr>
+            <a:graphic xmlns:a="http://schemas.openxmlformats.org/drawingml/2006/main">
+              <a:graphicData uri="http://schemas.openxmlformats.org/drawingml/2006/picture">
+                <pic:pic xmlns:pic="http://schemas.openxmlformats.org/drawingml/2006/picture">
+                  <pic:nvPicPr>
+                    <pic:cNvPr id="641094766" name=""/>
+                    <pic:cNvPicPr/>
+                  </pic:nvPicPr>
+                  <pic:blipFill>
+                    <a:blip r:embed="rId27"/>
+                    <a:stretch>
+                      <a:fillRect/>
+                    </a:stretch>
+                  </pic:blipFill>
+                  <pic:spPr>
+                    <a:xfrm>
+                      <a:off x="0" y="0"/>
+                      <a:ext cx="5731510" cy="3929380"/>
+                    </a:xfrm>
+                    <a:prstGeom prst="rect">
+                      <a:avLst/>
+                    </a:prstGeom>
+                  </pic:spPr>
+                </pic:pic>
+              </a:graphicData>
+            </a:graphic>
+          </wp:inline>
+        </w:drawing>
+      </w:r>
+    </w:p>
+    <w:p>
+      <w:pPr>
+        <w:pStyle w:val="Body"/>
+        <w:rPr>
+          <w:lang w:val="uk-UA"/>
+        </w:rPr>
+      </w:pPr>
+    </w:p>
+    <w:p>
+      <w:pPr>
+        <w:pStyle w:val="Heading1"/>
+        <w:rPr>
+          <w:lang w:val="uk-UA"/>
+        </w:rPr>
+      </w:pPr>
+      <w:r>
+        <w:rPr>
+          <w:lang w:val="uk-UA"/>
+        </w:rPr>
+        <w:lastRenderedPageBreak/>
+        <w:t>Індивідуальні завдання</w:t>
+      </w:r>
+    </w:p>
+    <w:p>
+      <w:pPr>
+        <w:pStyle w:val="Body"/>
+        <w:rPr>
+          <w:lang w:val="uk-UA"/>
+        </w:rPr>
+      </w:pPr>
+    </w:p>
+    <w:p>
+      <w:pPr>
+        <w:pStyle w:val="Body"/>
+        <w:numPr>
+          <w:ilvl w:val="0"/>
+          <w:numId w:val="33"/>
+        </w:numPr>
+        <w:rPr>
+          <w:lang w:val="uk-UA"/>
+        </w:rPr>
+      </w:pPr>
+      <w:r>
+        <w:rPr>
+          <w:lang w:val="uk-UA"/>
+        </w:rPr>
+        <w:t xml:space="preserve">Задати необідні частоти на виході </w:t>
+      </w:r>
+      <w:r>
+        <w:t>IP</w:t>
+      </w:r>
+      <w:r>
+        <w:rPr>
+          <w:lang w:val="uk-UA"/>
+        </w:rPr>
+        <w:t xml:space="preserve"> </w:t>
+      </w:r>
+      <w:r>
+        <w:rPr>
+          <w:lang w:val="uk-UA"/>
+        </w:rPr>
+        <w:t xml:space="preserve">блоку </w:t>
+      </w:r>
+      <w:r>
+        <w:t>Clocking</w:t>
+      </w:r>
+      <w:r>
+        <w:rPr>
+          <w:lang w:val="uk-UA"/>
+        </w:rPr>
+        <w:t xml:space="preserve"> </w:t>
+      </w:r>
+      <w:r>
+        <w:t>Wizard</w:t>
+      </w:r>
+      <w:r>
+        <w:rPr>
+          <w:lang w:val="uk-UA"/>
+        </w:rPr>
+        <w:t>.</w:t>
+      </w:r>
+    </w:p>
+    <w:p>
+      <w:pPr>
+        <w:pStyle w:val="Body"/>
+        <w:numPr>
+          <w:ilvl w:val="0"/>
+          <w:numId w:val="33"/>
+        </w:numPr>
+        <w:rPr>
+          <w:lang w:val="uk-UA"/>
+        </w:rPr>
+      </w:pPr>
+      <w:r>
+        <w:rPr>
+          <w:lang w:val="uk-UA"/>
+        </w:rPr>
+        <w:t>Змінити частоти блимання світлодіодів.</w:t>
+      </w:r>
+    </w:p>
+    <w:p>
+      <w:pPr>
+        <w:pStyle w:val="Body"/>
+        <w:numPr>
+          <w:ilvl w:val="0"/>
+          <w:numId w:val="33"/>
+        </w:numPr>
+        <w:rPr>
+          <w:lang w:val="uk-UA"/>
+        </w:rPr>
+      </w:pPr>
+      <w:r>
+        <w:rPr>
+          <w:lang w:val="uk-UA"/>
+        </w:rPr>
+        <w:t xml:space="preserve">Поміняти фази блимання світлодіодів – у фазі, </w:t>
+      </w:r>
+      <w:proofErr w:type="spellStart"/>
+      <w:r>
+        <w:rPr>
+          <w:lang w:val="uk-UA"/>
+        </w:rPr>
+        <w:t>протифазі</w:t>
+      </w:r>
+      <w:proofErr w:type="spellEnd"/>
+      <w:r>
+        <w:rPr>
+          <w:lang w:val="uk-UA"/>
+        </w:rPr>
+        <w:t>, квадратурні.</w:t>
+      </w:r>
+    </w:p>
+    <w:p>
+      <w:pPr>
+        <w:pStyle w:val="Body"/>
+        <w:numPr>
+          <w:ilvl w:val="0"/>
+          <w:numId w:val="33"/>
+        </w:numPr>
+        <w:rPr>
+          <w:lang w:val="uk-UA"/>
+        </w:rPr>
+      </w:pPr>
+      <w:r>
+        <w:rPr>
+          <w:lang w:val="uk-UA"/>
+        </w:rPr>
+        <w:t>За допомогою натиснення кнопок міняти частоти блимання, фази блимання.</w:t>
+      </w:r>
+    </w:p>
     <w:sectPr>
-      <w:headerReference w:type="even" r:id="rId24"/>
-      <w:headerReference w:type="default" r:id="rId25"/>
-      <w:footerReference w:type="even" r:id="rId26"/>
-      <w:footerReference w:type="default" r:id="rId27"/>
-      <w:headerReference w:type="first" r:id="rId28"/>
-      <w:footerReference w:type="first" r:id="rId29"/>
       <w:pgSz w:w="11906" w:h="16838" w:code="9"/>
       <w:pgMar w:top="1440" w:right="1440" w:bottom="1440" w:left="1440" w:header="708" w:footer="708" w:gutter="0"/>
       <w:cols w:space="708"/>
@@ -1103,36 +1844,6 @@
 </w:endnotes>
 </file>
 
-<file path=word/footer1.xml><?xml version="1.0" encoding="utf-8"?>
-<w:ftr xmlns:wpc="http://schemas.microsoft.com/office/word/2010/wordprocessingCanvas" xmlns:cx="http://schemas.microsoft.com/office/drawing/2014/chartex" xmlns:cx1="http://schemas.microsoft.com/office/drawing/2015/9/8/chartex" xmlns:cx2="http://schemas.microsoft.com/office/drawing/2015/10/21/chartex" xmlns:cx3="http://schemas.microsoft.com/office/drawing/2016/5/9/chartex" xmlns:cx4="http://schemas.microsoft.com/office/drawing/2016/5/10/chartex" xmlns:cx5="http://schemas.microsoft.com/office/drawing/2016/5/11/chartex" xmlns:cx6="http://schemas.microsoft.com/office/drawing/2016/5/12/chartex" xmlns:cx7="http://schemas.microsoft.com/office/drawing/2016/5/13/chartex" xmlns:cx8="http://schemas.microsoft.com/office/drawing/2016/5/14/chartex" xmlns:mc="http://schemas.openxmlformats.org/markup-compatibility/2006" xmlns:aink="http://schemas.microsoft.com/office/drawing/2016/ink" xmlns:am3d="http://schemas.microsoft.com/office/drawing/2017/model3d" xmlns:o="urn:schemas-microsoft-com:office:office" xmlns:oel="http://schemas.microsoft.com/office/2019/extlst" xmlns:r="http://schemas.openxmlformats.org/officeDocument/2006/relationships" xmlns:m="http://schemas.openxmlformats.org/officeDocument/2006/math" xmlns:v="urn:schemas-microsoft-com:vml" xmlns:wp14="http://schemas.microsoft.com/office/word/2010/wordprocessingDrawing" xmlns:wp="http://schemas.openxmlformats.org/drawingml/2006/wordprocessingDrawing" xmlns:w10="urn:schemas-microsoft-com:office:word" xmlns:w="http://schemas.openxmlformats.org/wordprocessingml/2006/main" xmlns:w14="http://schemas.microsoft.com/office/word/2010/wordml" xmlns:w15="http://schemas.microsoft.com/office/word/2012/wordml" xmlns:w16cex="http://schemas.microsoft.com/office/word/2018/wordml/cex" xmlns:w16cid="http://schemas.microsoft.com/office/word/2016/wordml/cid" xmlns:w16="http://schemas.microsoft.com/office/word/2018/wordml" xmlns:w16du="http://schemas.microsoft.com/office/word/2023/wordml/word16du" xmlns:w16sdtdh="http://schemas.microsoft.com/office/word/2020/wordml/sdtdatahash" xmlns:w16sdtfl="http://schemas.microsoft.com/office/word/2024/wordml/sdtformatlock" xmlns:w16se="http://schemas.microsoft.com/office/word/2015/wordml/symex" xmlns:wpg="http://schemas.microsoft.com/office/word/2010/wordprocessingGroup" xmlns:wpi="http://schemas.microsoft.com/office/word/2010/wordprocessingInk" xmlns:wne="http://schemas.microsoft.com/office/word/2006/wordml" xmlns:wps="http://schemas.microsoft.com/office/word/2010/wordprocessingShape" mc:Ignorable="w14 w15 w16se w16cid w16 w16cex w16sdtdh w16sdtfl w16du wp14">
-  <w:p>
-    <w:pPr>
-      <w:pStyle w:val="Footer"/>
-    </w:pPr>
-  </w:p>
-</w:ftr>
-</file>
-
-<file path=word/footer2.xml><?xml version="1.0" encoding="utf-8"?>
-<w:ftr xmlns:wpc="http://schemas.microsoft.com/office/word/2010/wordprocessingCanvas" xmlns:cx="http://schemas.microsoft.com/office/drawing/2014/chartex" xmlns:cx1="http://schemas.microsoft.com/office/drawing/2015/9/8/chartex" xmlns:cx2="http://schemas.microsoft.com/office/drawing/2015/10/21/chartex" xmlns:cx3="http://schemas.microsoft.com/office/drawing/2016/5/9/chartex" xmlns:cx4="http://schemas.microsoft.com/office/drawing/2016/5/10/chartex" xmlns:cx5="http://schemas.microsoft.com/office/drawing/2016/5/11/chartex" xmlns:cx6="http://schemas.microsoft.com/office/drawing/2016/5/12/chartex" xmlns:cx7="http://schemas.microsoft.com/office/drawing/2016/5/13/chartex" xmlns:cx8="http://schemas.microsoft.com/office/drawing/2016/5/14/chartex" xmlns:mc="http://schemas.openxmlformats.org/markup-compatibility/2006" xmlns:aink="http://schemas.microsoft.com/office/drawing/2016/ink" xmlns:am3d="http://schemas.microsoft.com/office/drawing/2017/model3d" xmlns:o="urn:schemas-microsoft-com:office:office" xmlns:oel="http://schemas.microsoft.com/office/2019/extlst" xmlns:r="http://schemas.openxmlformats.org/officeDocument/2006/relationships" xmlns:m="http://schemas.openxmlformats.org/officeDocument/2006/math" xmlns:v="urn:schemas-microsoft-com:vml" xmlns:wp14="http://schemas.microsoft.com/office/word/2010/wordprocessingDrawing" xmlns:wp="http://schemas.openxmlformats.org/drawingml/2006/wordprocessingDrawing" xmlns:w10="urn:schemas-microsoft-com:office:word" xmlns:w="http://schemas.openxmlformats.org/wordprocessingml/2006/main" xmlns:w14="http://schemas.microsoft.com/office/word/2010/wordml" xmlns:w15="http://schemas.microsoft.com/office/word/2012/wordml" xmlns:w16cex="http://schemas.microsoft.com/office/word/2018/wordml/cex" xmlns:w16cid="http://schemas.microsoft.com/office/word/2016/wordml/cid" xmlns:w16="http://schemas.microsoft.com/office/word/2018/wordml" xmlns:w16du="http://schemas.microsoft.com/office/word/2023/wordml/word16du" xmlns:w16sdtdh="http://schemas.microsoft.com/office/word/2020/wordml/sdtdatahash" xmlns:w16sdtfl="http://schemas.microsoft.com/office/word/2024/wordml/sdtformatlock" xmlns:w16se="http://schemas.microsoft.com/office/word/2015/wordml/symex" xmlns:wpg="http://schemas.microsoft.com/office/word/2010/wordprocessingGroup" xmlns:wpi="http://schemas.microsoft.com/office/word/2010/wordprocessingInk" xmlns:wne="http://schemas.microsoft.com/office/word/2006/wordml" xmlns:wps="http://schemas.microsoft.com/office/word/2010/wordprocessingShape" mc:Ignorable="w14 w15 w16se w16cid w16 w16cex w16sdtdh w16sdtfl w16du wp14">
-  <w:p>
-    <w:pPr>
-      <w:pStyle w:val="Footer"/>
-    </w:pPr>
-  </w:p>
-</w:ftr>
-</file>
-
-<file path=word/footer3.xml><?xml version="1.0" encoding="utf-8"?>
-<w:ftr xmlns:wpc="http://schemas.microsoft.com/office/word/2010/wordprocessingCanvas" xmlns:cx="http://schemas.microsoft.com/office/drawing/2014/chartex" xmlns:cx1="http://schemas.microsoft.com/office/drawing/2015/9/8/chartex" xmlns:cx2="http://schemas.microsoft.com/office/drawing/2015/10/21/chartex" xmlns:cx3="http://schemas.microsoft.com/office/drawing/2016/5/9/chartex" xmlns:cx4="http://schemas.microsoft.com/office/drawing/2016/5/10/chartex" xmlns:cx5="http://schemas.microsoft.com/office/drawing/2016/5/11/chartex" xmlns:cx6="http://schemas.microsoft.com/office/drawing/2016/5/12/chartex" xmlns:cx7="http://schemas.microsoft.com/office/drawing/2016/5/13/chartex" xmlns:cx8="http://schemas.microsoft.com/office/drawing/2016/5/14/chartex" xmlns:mc="http://schemas.openxmlformats.org/markup-compatibility/2006" xmlns:aink="http://schemas.microsoft.com/office/drawing/2016/ink" xmlns:am3d="http://schemas.microsoft.com/office/drawing/2017/model3d" xmlns:o="urn:schemas-microsoft-com:office:office" xmlns:oel="http://schemas.microsoft.com/office/2019/extlst" xmlns:r="http://schemas.openxmlformats.org/officeDocument/2006/relationships" xmlns:m="http://schemas.openxmlformats.org/officeDocument/2006/math" xmlns:v="urn:schemas-microsoft-com:vml" xmlns:wp14="http://schemas.microsoft.com/office/word/2010/wordprocessingDrawing" xmlns:wp="http://schemas.openxmlformats.org/drawingml/2006/wordprocessingDrawing" xmlns:w10="urn:schemas-microsoft-com:office:word" xmlns:w="http://schemas.openxmlformats.org/wordprocessingml/2006/main" xmlns:w14="http://schemas.microsoft.com/office/word/2010/wordml" xmlns:w15="http://schemas.microsoft.com/office/word/2012/wordml" xmlns:w16cex="http://schemas.microsoft.com/office/word/2018/wordml/cex" xmlns:w16cid="http://schemas.microsoft.com/office/word/2016/wordml/cid" xmlns:w16="http://schemas.microsoft.com/office/word/2018/wordml" xmlns:w16du="http://schemas.microsoft.com/office/word/2023/wordml/word16du" xmlns:w16sdtdh="http://schemas.microsoft.com/office/word/2020/wordml/sdtdatahash" xmlns:w16sdtfl="http://schemas.microsoft.com/office/word/2024/wordml/sdtformatlock" xmlns:w16se="http://schemas.microsoft.com/office/word/2015/wordml/symex" xmlns:wpg="http://schemas.microsoft.com/office/word/2010/wordprocessingGroup" xmlns:wpi="http://schemas.microsoft.com/office/word/2010/wordprocessingInk" xmlns:wne="http://schemas.microsoft.com/office/word/2006/wordml" xmlns:wps="http://schemas.microsoft.com/office/word/2010/wordprocessingShape" mc:Ignorable="w14 w15 w16se w16cid w16 w16cex w16sdtdh w16sdtfl w16du wp14">
-  <w:p>
-    <w:pPr>
-      <w:pStyle w:val="Footer"/>
-    </w:pPr>
-  </w:p>
-</w:ftr>
-</file>
-
 <file path=word/footnotes.xml><?xml version="1.0" encoding="utf-8"?>
 <w:footnotes xmlns:wpc="http://schemas.microsoft.com/office/word/2010/wordprocessingCanvas" xmlns:cx="http://schemas.microsoft.com/office/drawing/2014/chartex" xmlns:cx1="http://schemas.microsoft.com/office/drawing/2015/9/8/chartex" xmlns:cx2="http://schemas.microsoft.com/office/drawing/2015/10/21/chartex" xmlns:cx3="http://schemas.microsoft.com/office/drawing/2016/5/9/chartex" xmlns:cx4="http://schemas.microsoft.com/office/drawing/2016/5/10/chartex" xmlns:cx5="http://schemas.microsoft.com/office/drawing/2016/5/11/chartex" xmlns:cx6="http://schemas.microsoft.com/office/drawing/2016/5/12/chartex" xmlns:cx7="http://schemas.microsoft.com/office/drawing/2016/5/13/chartex" xmlns:cx8="http://schemas.microsoft.com/office/drawing/2016/5/14/chartex" xmlns:mc="http://schemas.openxmlformats.org/markup-compatibility/2006" xmlns:aink="http://schemas.microsoft.com/office/drawing/2016/ink" xmlns:am3d="http://schemas.microsoft.com/office/drawing/2017/model3d" xmlns:o="urn:schemas-microsoft-com:office:office" xmlns:oel="http://schemas.microsoft.com/office/2019/extlst" xmlns:r="http://schemas.openxmlformats.org/officeDocument/2006/relationships" xmlns:m="http://schemas.openxmlformats.org/officeDocument/2006/math" xmlns:v="urn:schemas-microsoft-com:vml" xmlns:wp14="http://schemas.microsoft.com/office/word/2010/wordprocessingDrawing" xmlns:wp="http://schemas.openxmlformats.org/drawingml/2006/wordprocessingDrawing" xmlns:w10="urn:schemas-microsoft-com:office:word" xmlns:w="http://schemas.openxmlformats.org/wordprocessingml/2006/main" xmlns:w14="http://schemas.microsoft.com/office/word/2010/wordml" xmlns:w15="http://schemas.microsoft.com/office/word/2012/wordml" xmlns:w16cex="http://schemas.microsoft.com/office/word/2018/wordml/cex" xmlns:w16cid="http://schemas.microsoft.com/office/word/2016/wordml/cid" xmlns:w16="http://schemas.microsoft.com/office/word/2018/wordml" xmlns:w16du="http://schemas.microsoft.com/office/word/2023/wordml/word16du" xmlns:w16sdtdh="http://schemas.microsoft.com/office/word/2020/wordml/sdtdatahash" xmlns:w16sdtfl="http://schemas.microsoft.com/office/word/2024/wordml/sdtformatlock" xmlns:w16se="http://schemas.microsoft.com/office/word/2015/wordml/symex" xmlns:wpg="http://schemas.microsoft.com/office/word/2010/wordprocessingGroup" xmlns:wpi="http://schemas.microsoft.com/office/word/2010/wordprocessingInk" xmlns:wne="http://schemas.microsoft.com/office/word/2006/wordml" xmlns:wps="http://schemas.microsoft.com/office/word/2010/wordprocessingShape" mc:Ignorable="w14 w15 w16se w16cid w16 w16cex w16sdtdh w16sdtfl w16du wp14">
   <w:footnote w:type="separator" w:id="-1">
@@ -1150,36 +1861,6 @@
     </w:p>
   </w:footnote>
 </w:footnotes>
-</file>
-
-<file path=word/header1.xml><?xml version="1.0" encoding="utf-8"?>
-<w:hdr xmlns:wpc="http://schemas.microsoft.com/office/word/2010/wordprocessingCanvas" xmlns:cx="http://schemas.microsoft.com/office/drawing/2014/chartex" xmlns:cx1="http://schemas.microsoft.com/office/drawing/2015/9/8/chartex" xmlns:cx2="http://schemas.microsoft.com/office/drawing/2015/10/21/chartex" xmlns:cx3="http://schemas.microsoft.com/office/drawing/2016/5/9/chartex" xmlns:cx4="http://schemas.microsoft.com/office/drawing/2016/5/10/chartex" xmlns:cx5="http://schemas.microsoft.com/office/drawing/2016/5/11/chartex" xmlns:cx6="http://schemas.microsoft.com/office/drawing/2016/5/12/chartex" xmlns:cx7="http://schemas.microsoft.com/office/drawing/2016/5/13/chartex" xmlns:cx8="http://schemas.microsoft.com/office/drawing/2016/5/14/chartex" xmlns:mc="http://schemas.openxmlformats.org/markup-compatibility/2006" xmlns:aink="http://schemas.microsoft.com/office/drawing/2016/ink" xmlns:am3d="http://schemas.microsoft.com/office/drawing/2017/model3d" xmlns:o="urn:schemas-microsoft-com:office:office" xmlns:oel="http://schemas.microsoft.com/office/2019/extlst" xmlns:r="http://schemas.openxmlformats.org/officeDocument/2006/relationships" xmlns:m="http://schemas.openxmlformats.org/officeDocument/2006/math" xmlns:v="urn:schemas-microsoft-com:vml" xmlns:wp14="http://schemas.microsoft.com/office/word/2010/wordprocessingDrawing" xmlns:wp="http://schemas.openxmlformats.org/drawingml/2006/wordprocessingDrawing" xmlns:w10="urn:schemas-microsoft-com:office:word" xmlns:w="http://schemas.openxmlformats.org/wordprocessingml/2006/main" xmlns:w14="http://schemas.microsoft.com/office/word/2010/wordml" xmlns:w15="http://schemas.microsoft.com/office/word/2012/wordml" xmlns:w16cex="http://schemas.microsoft.com/office/word/2018/wordml/cex" xmlns:w16cid="http://schemas.microsoft.com/office/word/2016/wordml/cid" xmlns:w16="http://schemas.microsoft.com/office/word/2018/wordml" xmlns:w16du="http://schemas.microsoft.com/office/word/2023/wordml/word16du" xmlns:w16sdtdh="http://schemas.microsoft.com/office/word/2020/wordml/sdtdatahash" xmlns:w16sdtfl="http://schemas.microsoft.com/office/word/2024/wordml/sdtformatlock" xmlns:w16se="http://schemas.microsoft.com/office/word/2015/wordml/symex" xmlns:wpg="http://schemas.microsoft.com/office/word/2010/wordprocessingGroup" xmlns:wpi="http://schemas.microsoft.com/office/word/2010/wordprocessingInk" xmlns:wne="http://schemas.microsoft.com/office/word/2006/wordml" xmlns:wps="http://schemas.microsoft.com/office/word/2010/wordprocessingShape" mc:Ignorable="w14 w15 w16se w16cid w16 w16cex w16sdtdh w16sdtfl w16du wp14">
-  <w:p>
-    <w:pPr>
-      <w:pStyle w:val="Header"/>
-    </w:pPr>
-  </w:p>
-</w:hdr>
-</file>
-
-<file path=word/header2.xml><?xml version="1.0" encoding="utf-8"?>
-<w:hdr xmlns:wpc="http://schemas.microsoft.com/office/word/2010/wordprocessingCanvas" xmlns:cx="http://schemas.microsoft.com/office/drawing/2014/chartex" xmlns:cx1="http://schemas.microsoft.com/office/drawing/2015/9/8/chartex" xmlns:cx2="http://schemas.microsoft.com/office/drawing/2015/10/21/chartex" xmlns:cx3="http://schemas.microsoft.com/office/drawing/2016/5/9/chartex" xmlns:cx4="http://schemas.microsoft.com/office/drawing/2016/5/10/chartex" xmlns:cx5="http://schemas.microsoft.com/office/drawing/2016/5/11/chartex" xmlns:cx6="http://schemas.microsoft.com/office/drawing/2016/5/12/chartex" xmlns:cx7="http://schemas.microsoft.com/office/drawing/2016/5/13/chartex" xmlns:cx8="http://schemas.microsoft.com/office/drawing/2016/5/14/chartex" xmlns:mc="http://schemas.openxmlformats.org/markup-compatibility/2006" xmlns:aink="http://schemas.microsoft.com/office/drawing/2016/ink" xmlns:am3d="http://schemas.microsoft.com/office/drawing/2017/model3d" xmlns:o="urn:schemas-microsoft-com:office:office" xmlns:oel="http://schemas.microsoft.com/office/2019/extlst" xmlns:r="http://schemas.openxmlformats.org/officeDocument/2006/relationships" xmlns:m="http://schemas.openxmlformats.org/officeDocument/2006/math" xmlns:v="urn:schemas-microsoft-com:vml" xmlns:wp14="http://schemas.microsoft.com/office/word/2010/wordprocessingDrawing" xmlns:wp="http://schemas.openxmlformats.org/drawingml/2006/wordprocessingDrawing" xmlns:w10="urn:schemas-microsoft-com:office:word" xmlns:w="http://schemas.openxmlformats.org/wordprocessingml/2006/main" xmlns:w14="http://schemas.microsoft.com/office/word/2010/wordml" xmlns:w15="http://schemas.microsoft.com/office/word/2012/wordml" xmlns:w16cex="http://schemas.microsoft.com/office/word/2018/wordml/cex" xmlns:w16cid="http://schemas.microsoft.com/office/word/2016/wordml/cid" xmlns:w16="http://schemas.microsoft.com/office/word/2018/wordml" xmlns:w16du="http://schemas.microsoft.com/office/word/2023/wordml/word16du" xmlns:w16sdtdh="http://schemas.microsoft.com/office/word/2020/wordml/sdtdatahash" xmlns:w16sdtfl="http://schemas.microsoft.com/office/word/2024/wordml/sdtformatlock" xmlns:w16se="http://schemas.microsoft.com/office/word/2015/wordml/symex" xmlns:wpg="http://schemas.microsoft.com/office/word/2010/wordprocessingGroup" xmlns:wpi="http://schemas.microsoft.com/office/word/2010/wordprocessingInk" xmlns:wne="http://schemas.microsoft.com/office/word/2006/wordml" xmlns:wps="http://schemas.microsoft.com/office/word/2010/wordprocessingShape" mc:Ignorable="w14 w15 w16se w16cid w16 w16cex w16sdtdh w16sdtfl w16du wp14">
-  <w:p>
-    <w:pPr>
-      <w:pStyle w:val="Header"/>
-    </w:pPr>
-  </w:p>
-</w:hdr>
-</file>
-
-<file path=word/header3.xml><?xml version="1.0" encoding="utf-8"?>
-<w:hdr xmlns:wpc="http://schemas.microsoft.com/office/word/2010/wordprocessingCanvas" xmlns:cx="http://schemas.microsoft.com/office/drawing/2014/chartex" xmlns:cx1="http://schemas.microsoft.com/office/drawing/2015/9/8/chartex" xmlns:cx2="http://schemas.microsoft.com/office/drawing/2015/10/21/chartex" xmlns:cx3="http://schemas.microsoft.com/office/drawing/2016/5/9/chartex" xmlns:cx4="http://schemas.microsoft.com/office/drawing/2016/5/10/chartex" xmlns:cx5="http://schemas.microsoft.com/office/drawing/2016/5/11/chartex" xmlns:cx6="http://schemas.microsoft.com/office/drawing/2016/5/12/chartex" xmlns:cx7="http://schemas.microsoft.com/office/drawing/2016/5/13/chartex" xmlns:cx8="http://schemas.microsoft.com/office/drawing/2016/5/14/chartex" xmlns:mc="http://schemas.openxmlformats.org/markup-compatibility/2006" xmlns:aink="http://schemas.microsoft.com/office/drawing/2016/ink" xmlns:am3d="http://schemas.microsoft.com/office/drawing/2017/model3d" xmlns:o="urn:schemas-microsoft-com:office:office" xmlns:oel="http://schemas.microsoft.com/office/2019/extlst" xmlns:r="http://schemas.openxmlformats.org/officeDocument/2006/relationships" xmlns:m="http://schemas.openxmlformats.org/officeDocument/2006/math" xmlns:v="urn:schemas-microsoft-com:vml" xmlns:wp14="http://schemas.microsoft.com/office/word/2010/wordprocessingDrawing" xmlns:wp="http://schemas.openxmlformats.org/drawingml/2006/wordprocessingDrawing" xmlns:w10="urn:schemas-microsoft-com:office:word" xmlns:w="http://schemas.openxmlformats.org/wordprocessingml/2006/main" xmlns:w14="http://schemas.microsoft.com/office/word/2010/wordml" xmlns:w15="http://schemas.microsoft.com/office/word/2012/wordml" xmlns:w16cex="http://schemas.microsoft.com/office/word/2018/wordml/cex" xmlns:w16cid="http://schemas.microsoft.com/office/word/2016/wordml/cid" xmlns:w16="http://schemas.microsoft.com/office/word/2018/wordml" xmlns:w16du="http://schemas.microsoft.com/office/word/2023/wordml/word16du" xmlns:w16sdtdh="http://schemas.microsoft.com/office/word/2020/wordml/sdtdatahash" xmlns:w16sdtfl="http://schemas.microsoft.com/office/word/2024/wordml/sdtformatlock" xmlns:w16se="http://schemas.microsoft.com/office/word/2015/wordml/symex" xmlns:wpg="http://schemas.microsoft.com/office/word/2010/wordprocessingGroup" xmlns:wpi="http://schemas.microsoft.com/office/word/2010/wordprocessingInk" xmlns:wne="http://schemas.microsoft.com/office/word/2006/wordml" xmlns:wps="http://schemas.microsoft.com/office/word/2010/wordprocessingShape" mc:Ignorable="w14 w15 w16se w16cid w16 w16cex w16sdtdh w16sdtfl w16du wp14">
-  <w:p>
-    <w:pPr>
-      <w:pStyle w:val="Header"/>
-    </w:pPr>
-  </w:p>
-</w:hdr>
 </file>
 
 <file path=word/numbering.xml><?xml version="1.0" encoding="utf-8"?>
@@ -1924,6 +2605,119 @@
     </w:lvl>
   </w:abstractNum>
   <w:abstractNum w:abstractNumId="5" w15:restartNumberingAfterBreak="0">
+    <w:nsid w:val="22597613"/>
+    <w:multiLevelType w:val="hybridMultilevel"/>
+    <w:tmpl w:val="6DFE0576"/>
+    <w:lvl w:ilvl="0" w:tplc="893E8164">
+      <w:start w:val="2"/>
+      <w:numFmt w:val="bullet"/>
+      <w:lvlText w:val="-"/>
+      <w:lvlJc w:val="left"/>
+      <w:pPr>
+        <w:ind w:left="720" w:hanging="360"/>
+      </w:pPr>
+      <w:rPr>
+        <w:rFonts w:ascii="Source Sans Pro" w:eastAsia="Times New Roman" w:hAnsi="Source Sans Pro" w:cs="Times New Roman" w:hint="default"/>
+      </w:rPr>
+    </w:lvl>
+    <w:lvl w:ilvl="1" w:tplc="04220003" w:tentative="1">
+      <w:start w:val="1"/>
+      <w:numFmt w:val="bullet"/>
+      <w:lvlText w:val="o"/>
+      <w:lvlJc w:val="left"/>
+      <w:pPr>
+        <w:ind w:left="1440" w:hanging="360"/>
+      </w:pPr>
+      <w:rPr>
+        <w:rFonts w:ascii="Courier New" w:hAnsi="Courier New" w:cs="Courier New" w:hint="default"/>
+      </w:rPr>
+    </w:lvl>
+    <w:lvl w:ilvl="2" w:tplc="04220005" w:tentative="1">
+      <w:start w:val="1"/>
+      <w:numFmt w:val="bullet"/>
+      <w:lvlText w:val=""/>
+      <w:lvlJc w:val="left"/>
+      <w:pPr>
+        <w:ind w:left="2160" w:hanging="360"/>
+      </w:pPr>
+      <w:rPr>
+        <w:rFonts w:ascii="Wingdings" w:hAnsi="Wingdings" w:hint="default"/>
+      </w:rPr>
+    </w:lvl>
+    <w:lvl w:ilvl="3" w:tplc="04220001" w:tentative="1">
+      <w:start w:val="1"/>
+      <w:numFmt w:val="bullet"/>
+      <w:lvlText w:val=""/>
+      <w:lvlJc w:val="left"/>
+      <w:pPr>
+        <w:ind w:left="2880" w:hanging="360"/>
+      </w:pPr>
+      <w:rPr>
+        <w:rFonts w:ascii="Symbol" w:hAnsi="Symbol" w:hint="default"/>
+      </w:rPr>
+    </w:lvl>
+    <w:lvl w:ilvl="4" w:tplc="04220003" w:tentative="1">
+      <w:start w:val="1"/>
+      <w:numFmt w:val="bullet"/>
+      <w:lvlText w:val="o"/>
+      <w:lvlJc w:val="left"/>
+      <w:pPr>
+        <w:ind w:left="3600" w:hanging="360"/>
+      </w:pPr>
+      <w:rPr>
+        <w:rFonts w:ascii="Courier New" w:hAnsi="Courier New" w:cs="Courier New" w:hint="default"/>
+      </w:rPr>
+    </w:lvl>
+    <w:lvl w:ilvl="5" w:tplc="04220005" w:tentative="1">
+      <w:start w:val="1"/>
+      <w:numFmt w:val="bullet"/>
+      <w:lvlText w:val=""/>
+      <w:lvlJc w:val="left"/>
+      <w:pPr>
+        <w:ind w:left="4320" w:hanging="360"/>
+      </w:pPr>
+      <w:rPr>
+        <w:rFonts w:ascii="Wingdings" w:hAnsi="Wingdings" w:hint="default"/>
+      </w:rPr>
+    </w:lvl>
+    <w:lvl w:ilvl="6" w:tplc="04220001" w:tentative="1">
+      <w:start w:val="1"/>
+      <w:numFmt w:val="bullet"/>
+      <w:lvlText w:val=""/>
+      <w:lvlJc w:val="left"/>
+      <w:pPr>
+        <w:ind w:left="5040" w:hanging="360"/>
+      </w:pPr>
+      <w:rPr>
+        <w:rFonts w:ascii="Symbol" w:hAnsi="Symbol" w:hint="default"/>
+      </w:rPr>
+    </w:lvl>
+    <w:lvl w:ilvl="7" w:tplc="04220003" w:tentative="1">
+      <w:start w:val="1"/>
+      <w:numFmt w:val="bullet"/>
+      <w:lvlText w:val="o"/>
+      <w:lvlJc w:val="left"/>
+      <w:pPr>
+        <w:ind w:left="5760" w:hanging="360"/>
+      </w:pPr>
+      <w:rPr>
+        <w:rFonts w:ascii="Courier New" w:hAnsi="Courier New" w:cs="Courier New" w:hint="default"/>
+      </w:rPr>
+    </w:lvl>
+    <w:lvl w:ilvl="8" w:tplc="04220005" w:tentative="1">
+      <w:start w:val="1"/>
+      <w:numFmt w:val="bullet"/>
+      <w:lvlText w:val=""/>
+      <w:lvlJc w:val="left"/>
+      <w:pPr>
+        <w:ind w:left="6480" w:hanging="360"/>
+      </w:pPr>
+      <w:rPr>
+        <w:rFonts w:ascii="Wingdings" w:hAnsi="Wingdings" w:hint="default"/>
+      </w:rPr>
+    </w:lvl>
+  </w:abstractNum>
+  <w:abstractNum w:abstractNumId="6" w15:restartNumberingAfterBreak="0">
     <w:nsid w:val="309A47D7"/>
     <w:multiLevelType w:val="multilevel"/>
     <w:tmpl w:val="21C280D6"/>
@@ -2068,7 +2862,7 @@
       </w:rPr>
     </w:lvl>
   </w:abstractNum>
-  <w:abstractNum w:abstractNumId="6" w15:restartNumberingAfterBreak="0">
+  <w:abstractNum w:abstractNumId="7" w15:restartNumberingAfterBreak="0">
     <w:nsid w:val="32273695"/>
     <w:multiLevelType w:val="multilevel"/>
     <w:tmpl w:val="9DFA0F50"/>
@@ -2213,7 +3007,7 @@
       </w:rPr>
     </w:lvl>
   </w:abstractNum>
-  <w:abstractNum w:abstractNumId="7" w15:restartNumberingAfterBreak="0">
+  <w:abstractNum w:abstractNumId="8" w15:restartNumberingAfterBreak="0">
     <w:nsid w:val="340B507A"/>
     <w:multiLevelType w:val="multilevel"/>
     <w:tmpl w:val="7C60D5BC"/>
@@ -2359,7 +3153,7 @@
       </w:rPr>
     </w:lvl>
   </w:abstractNum>
-  <w:abstractNum w:abstractNumId="8" w15:restartNumberingAfterBreak="0">
+  <w:abstractNum w:abstractNumId="9" w15:restartNumberingAfterBreak="0">
     <w:nsid w:val="3778452C"/>
     <w:multiLevelType w:val="multilevel"/>
     <w:tmpl w:val="C5B402DA"/>
@@ -2519,7 +3313,7 @@
       </w:rPr>
     </w:lvl>
   </w:abstractNum>
-  <w:abstractNum w:abstractNumId="9" w15:restartNumberingAfterBreak="0">
+  <w:abstractNum w:abstractNumId="10" w15:restartNumberingAfterBreak="0">
     <w:nsid w:val="39791F92"/>
     <w:multiLevelType w:val="multilevel"/>
     <w:tmpl w:val="B69AA504"/>
@@ -2667,7 +3461,7 @@
       </w:rPr>
     </w:lvl>
   </w:abstractNum>
-  <w:abstractNum w:abstractNumId="10" w15:restartNumberingAfterBreak="0">
+  <w:abstractNum w:abstractNumId="11" w15:restartNumberingAfterBreak="0">
     <w:nsid w:val="3A7D06A0"/>
     <w:multiLevelType w:val="multilevel"/>
     <w:tmpl w:val="6ED4558C"/>
@@ -2812,7 +3606,7 @@
       </w:rPr>
     </w:lvl>
   </w:abstractNum>
-  <w:abstractNum w:abstractNumId="11" w15:restartNumberingAfterBreak="0">
+  <w:abstractNum w:abstractNumId="12" w15:restartNumberingAfterBreak="0">
     <w:nsid w:val="40361AD5"/>
     <w:multiLevelType w:val="multilevel"/>
     <w:tmpl w:val="006A53F0"/>
@@ -2957,7 +3751,7 @@
       </w:rPr>
     </w:lvl>
   </w:abstractNum>
-  <w:abstractNum w:abstractNumId="12" w15:restartNumberingAfterBreak="0">
+  <w:abstractNum w:abstractNumId="13" w15:restartNumberingAfterBreak="0">
     <w:nsid w:val="45B97DBF"/>
     <w:multiLevelType w:val="multilevel"/>
     <w:tmpl w:val="16D0A81E"/>
@@ -3054,7 +3848,7 @@
       </w:pPr>
     </w:lvl>
   </w:abstractNum>
-  <w:abstractNum w:abstractNumId="13" w15:restartNumberingAfterBreak="0">
+  <w:abstractNum w:abstractNumId="14" w15:restartNumberingAfterBreak="0">
     <w:nsid w:val="65C8738A"/>
     <w:multiLevelType w:val="multilevel"/>
     <w:tmpl w:val="0B701C44"/>
@@ -3200,7 +3994,7 @@
       </w:rPr>
     </w:lvl>
   </w:abstractNum>
-  <w:abstractNum w:abstractNumId="14" w15:restartNumberingAfterBreak="0">
+  <w:abstractNum w:abstractNumId="15" w15:restartNumberingAfterBreak="0">
     <w:nsid w:val="65CA3A68"/>
     <w:multiLevelType w:val="hybridMultilevel"/>
     <w:tmpl w:val="E036147A"/>
@@ -3321,23 +4115,136 @@
       </w:pPr>
     </w:lvl>
   </w:abstractNum>
+  <w:abstractNum w:abstractNumId="16" w15:restartNumberingAfterBreak="0">
+    <w:nsid w:val="7EA2500D"/>
+    <w:multiLevelType w:val="hybridMultilevel"/>
+    <w:tmpl w:val="92125A56"/>
+    <w:lvl w:ilvl="0" w:tplc="04220001">
+      <w:start w:val="1"/>
+      <w:numFmt w:val="bullet"/>
+      <w:lvlText w:val=""/>
+      <w:lvlJc w:val="left"/>
+      <w:pPr>
+        <w:ind w:left="720" w:hanging="360"/>
+      </w:pPr>
+      <w:rPr>
+        <w:rFonts w:ascii="Symbol" w:hAnsi="Symbol" w:hint="default"/>
+      </w:rPr>
+    </w:lvl>
+    <w:lvl w:ilvl="1" w:tplc="04220003" w:tentative="1">
+      <w:start w:val="1"/>
+      <w:numFmt w:val="bullet"/>
+      <w:lvlText w:val="o"/>
+      <w:lvlJc w:val="left"/>
+      <w:pPr>
+        <w:ind w:left="1440" w:hanging="360"/>
+      </w:pPr>
+      <w:rPr>
+        <w:rFonts w:ascii="Courier New" w:hAnsi="Courier New" w:cs="Courier New" w:hint="default"/>
+      </w:rPr>
+    </w:lvl>
+    <w:lvl w:ilvl="2" w:tplc="04220005" w:tentative="1">
+      <w:start w:val="1"/>
+      <w:numFmt w:val="bullet"/>
+      <w:lvlText w:val=""/>
+      <w:lvlJc w:val="left"/>
+      <w:pPr>
+        <w:ind w:left="2160" w:hanging="360"/>
+      </w:pPr>
+      <w:rPr>
+        <w:rFonts w:ascii="Wingdings" w:hAnsi="Wingdings" w:hint="default"/>
+      </w:rPr>
+    </w:lvl>
+    <w:lvl w:ilvl="3" w:tplc="04220001" w:tentative="1">
+      <w:start w:val="1"/>
+      <w:numFmt w:val="bullet"/>
+      <w:lvlText w:val=""/>
+      <w:lvlJc w:val="left"/>
+      <w:pPr>
+        <w:ind w:left="2880" w:hanging="360"/>
+      </w:pPr>
+      <w:rPr>
+        <w:rFonts w:ascii="Symbol" w:hAnsi="Symbol" w:hint="default"/>
+      </w:rPr>
+    </w:lvl>
+    <w:lvl w:ilvl="4" w:tplc="04220003" w:tentative="1">
+      <w:start w:val="1"/>
+      <w:numFmt w:val="bullet"/>
+      <w:lvlText w:val="o"/>
+      <w:lvlJc w:val="left"/>
+      <w:pPr>
+        <w:ind w:left="3600" w:hanging="360"/>
+      </w:pPr>
+      <w:rPr>
+        <w:rFonts w:ascii="Courier New" w:hAnsi="Courier New" w:cs="Courier New" w:hint="default"/>
+      </w:rPr>
+    </w:lvl>
+    <w:lvl w:ilvl="5" w:tplc="04220005" w:tentative="1">
+      <w:start w:val="1"/>
+      <w:numFmt w:val="bullet"/>
+      <w:lvlText w:val=""/>
+      <w:lvlJc w:val="left"/>
+      <w:pPr>
+        <w:ind w:left="4320" w:hanging="360"/>
+      </w:pPr>
+      <w:rPr>
+        <w:rFonts w:ascii="Wingdings" w:hAnsi="Wingdings" w:hint="default"/>
+      </w:rPr>
+    </w:lvl>
+    <w:lvl w:ilvl="6" w:tplc="04220001" w:tentative="1">
+      <w:start w:val="1"/>
+      <w:numFmt w:val="bullet"/>
+      <w:lvlText w:val=""/>
+      <w:lvlJc w:val="left"/>
+      <w:pPr>
+        <w:ind w:left="5040" w:hanging="360"/>
+      </w:pPr>
+      <w:rPr>
+        <w:rFonts w:ascii="Symbol" w:hAnsi="Symbol" w:hint="default"/>
+      </w:rPr>
+    </w:lvl>
+    <w:lvl w:ilvl="7" w:tplc="04220003" w:tentative="1">
+      <w:start w:val="1"/>
+      <w:numFmt w:val="bullet"/>
+      <w:lvlText w:val="o"/>
+      <w:lvlJc w:val="left"/>
+      <w:pPr>
+        <w:ind w:left="5760" w:hanging="360"/>
+      </w:pPr>
+      <w:rPr>
+        <w:rFonts w:ascii="Courier New" w:hAnsi="Courier New" w:cs="Courier New" w:hint="default"/>
+      </w:rPr>
+    </w:lvl>
+    <w:lvl w:ilvl="8" w:tplc="04220005" w:tentative="1">
+      <w:start w:val="1"/>
+      <w:numFmt w:val="bullet"/>
+      <w:lvlText w:val=""/>
+      <w:lvlJc w:val="left"/>
+      <w:pPr>
+        <w:ind w:left="6480" w:hanging="360"/>
+      </w:pPr>
+      <w:rPr>
+        <w:rFonts w:ascii="Wingdings" w:hAnsi="Wingdings" w:hint="default"/>
+      </w:rPr>
+    </w:lvl>
+  </w:abstractNum>
   <w:num w:numId="1" w16cid:durableId="1122190688">
     <w:abstractNumId w:val="3"/>
   </w:num>
   <w:num w:numId="2" w16cid:durableId="2104373178">
-    <w:abstractNumId w:val="5"/>
+    <w:abstractNumId w:val="6"/>
   </w:num>
   <w:num w:numId="3" w16cid:durableId="782001302">
-    <w:abstractNumId w:val="6"/>
+    <w:abstractNumId w:val="7"/>
   </w:num>
   <w:num w:numId="4" w16cid:durableId="193352521">
-    <w:abstractNumId w:val="12"/>
+    <w:abstractNumId w:val="13"/>
   </w:num>
   <w:num w:numId="5" w16cid:durableId="1669361382">
-    <w:abstractNumId w:val="13"/>
+    <w:abstractNumId w:val="14"/>
   </w:num>
   <w:num w:numId="6" w16cid:durableId="2128310354">
-    <w:abstractNumId w:val="14"/>
+    <w:abstractNumId w:val="15"/>
   </w:num>
   <w:num w:numId="7" w16cid:durableId="353383162">
     <w:abstractNumId w:val="1"/>
@@ -3364,10 +4271,10 @@
     <w:abstractNumId w:val="3"/>
   </w:num>
   <w:num w:numId="15" w16cid:durableId="1908035481">
-    <w:abstractNumId w:val="5"/>
+    <w:abstractNumId w:val="6"/>
   </w:num>
   <w:num w:numId="16" w16cid:durableId="1540388027">
-    <w:abstractNumId w:val="6"/>
+    <w:abstractNumId w:val="7"/>
   </w:num>
   <w:num w:numId="17" w16cid:durableId="1044327681">
     <w:abstractNumId w:val="1"/>
@@ -3376,25 +4283,25 @@
     <w:abstractNumId w:val="2"/>
   </w:num>
   <w:num w:numId="19" w16cid:durableId="1308584831">
-    <w:abstractNumId w:val="7"/>
+    <w:abstractNumId w:val="8"/>
   </w:num>
   <w:num w:numId="20" w16cid:durableId="1620919185">
     <w:abstractNumId w:val="4"/>
   </w:num>
   <w:num w:numId="21" w16cid:durableId="1743066749">
-    <w:abstractNumId w:val="8"/>
+    <w:abstractNumId w:val="9"/>
   </w:num>
   <w:num w:numId="22" w16cid:durableId="228923766">
+    <w:abstractNumId w:val="11"/>
+  </w:num>
+  <w:num w:numId="23" w16cid:durableId="1296374601">
     <w:abstractNumId w:val="10"/>
   </w:num>
-  <w:num w:numId="23" w16cid:durableId="1296374601">
-    <w:abstractNumId w:val="9"/>
-  </w:num>
   <w:num w:numId="24" w16cid:durableId="1980569179">
-    <w:abstractNumId w:val="11"/>
+    <w:abstractNumId w:val="12"/>
   </w:num>
   <w:num w:numId="25" w16cid:durableId="470907177">
-    <w:abstractNumId w:val="7"/>
+    <w:abstractNumId w:val="8"/>
   </w:num>
   <w:num w:numId="26" w16cid:durableId="657881948">
     <w:abstractNumId w:val="4"/>
@@ -3447,7 +4354,7 @@
     </w:lvlOverride>
   </w:num>
   <w:num w:numId="28" w16cid:durableId="34236164">
-    <w:abstractNumId w:val="8"/>
+    <w:abstractNumId w:val="9"/>
     <w:lvlOverride w:ilvl="0">
       <w:lvl w:ilvl="0">
         <w:start w:val="1"/>
@@ -3482,7 +4389,7 @@
     </w:lvlOverride>
   </w:num>
   <w:num w:numId="29" w16cid:durableId="202443964">
-    <w:abstractNumId w:val="10"/>
+    <w:abstractNumId w:val="11"/>
     <w:lvlOverride w:ilvl="0">
       <w:lvl w:ilvl="0">
         <w:start w:val="1"/>
@@ -3507,7 +4414,7 @@
     </w:lvlOverride>
   </w:num>
   <w:num w:numId="30" w16cid:durableId="1503735884">
-    <w:abstractNumId w:val="9"/>
+    <w:abstractNumId w:val="10"/>
     <w:lvlOverride w:ilvl="0">
       <w:lvl w:ilvl="0">
         <w:start w:val="1"/>
@@ -3535,7 +4442,7 @@
     </w:lvlOverride>
   </w:num>
   <w:num w:numId="31" w16cid:durableId="999192625">
-    <w:abstractNumId w:val="11"/>
+    <w:abstractNumId w:val="12"/>
     <w:lvlOverride w:ilvl="0">
       <w:lvl w:ilvl="0">
         <w:start w:val="1"/>
@@ -3558,6 +4465,12 @@
         </w:rPr>
       </w:lvl>
     </w:lvlOverride>
+  </w:num>
+  <w:num w:numId="32" w16cid:durableId="1567884100">
+    <w:abstractNumId w:val="16"/>
+  </w:num>
+  <w:num w:numId="33" w16cid:durableId="197395867">
+    <w:abstractNumId w:val="5"/>
   </w:num>
 </w:numbering>
 </file>
@@ -4146,6 +5059,7 @@
   <w:style w:type="character" w:default="1" w:styleId="DefaultParagraphFont">
     <w:name w:val="Default Paragraph Font"/>
     <w:uiPriority w:val="1"/>
+    <w:semiHidden/>
     <w:unhideWhenUsed/>
   </w:style>
   <w:style w:type="table" w:default="1" w:styleId="TableNormal">

</xml_diff>